<commit_message>
Corrige la numérotation des pages du pied de page
La valeur de cache des champs PAGE / NUMPAGES était placée après la fin
du champ : Word affichait un « 1 » parasite collé au numéro calculé
(« Page 21 / 221 » au lieu de « Page 2 / 22 »). La valeur de cache est
désormais insérée entre les marqueurs separate et end.

Co-Authored-By: Claude Opus 4.8 <noreply@anthropic.com>
Claude-Session: https://claude.ai/code/session_01MV1WfKjenD7PU2HYRn8deu
</commit_message>
<xml_diff>
--- a/Projet_GREMLIN_Dossier.docx
+++ b/Projet_GREMLIN_Dossier.docx
@@ -21372,10 +21372,16 @@
       <w:fldChar w:fldCharType="begin"/>
       <w:instrText xml:space="preserve"> PAGE </w:instrText>
       <w:fldChar w:fldCharType="separate"/>
-      <w:fldChar w:fldCharType="end"/>
     </w:r>
     <w:r>
+      <w:rPr>
+        <w:color w:val="7F7F7F"/>
+        <w:sz w:val="17"/>
+      </w:rPr>
       <w:t>1</w:t>
+    </w:r>
+    <w:r>
+      <w:fldChar w:fldCharType="end"/>
     </w:r>
     <w:r>
       <w:rPr>
@@ -21388,10 +21394,16 @@
       <w:fldChar w:fldCharType="begin"/>
       <w:instrText xml:space="preserve"> NUMPAGES </w:instrText>
       <w:fldChar w:fldCharType="separate"/>
-      <w:fldChar w:fldCharType="end"/>
     </w:r>
     <w:r>
+      <w:rPr>
+        <w:color w:val="7F7F7F"/>
+        <w:sz w:val="17"/>
+      </w:rPr>
       <w:t>1</w:t>
+    </w:r>
+    <w:r>
+      <w:fldChar w:fldCharType="end"/>
     </w:r>
     <w:r>
       <w:tab/>

</xml_diff>